<commit_message>
tarea s12 - tercer test login + cuenta de la repeticion
</commit_message>
<xml_diff>
--- a/Respuesta Tarea S10.docx
+++ b/Respuesta Tarea S10.docx
@@ -16,15 +16,7 @@
           <w:color w:val="000099"/>
           <w:lang w:val="es-VE"/>
         </w:rPr>
-        <w:t xml:space="preserve">## Paso 1 — Confirma que </w:t>
-      </w:r>
-      <w:r>
-        <w:rPr>
-          <w:b/>
-          <w:color w:val="000099"/>
-          <w:lang w:val="es-VE"/>
-        </w:rPr>
-        <w:t xml:space="preserve">tu </w:t>
+        <w:t xml:space="preserve">## Paso 1 — Confirma que tu </w:t>
       </w:r>
       <w:proofErr w:type="spellStart"/>
       <w:r>
@@ -1439,10 +1431,10 @@
         </w:rPr>
         <w:lastRenderedPageBreak/>
         <w:drawing>
-          <wp:inline distT="0" distB="0" distL="0" distR="0" wp14:anchorId="404CC7AE" wp14:editId="6531B158">
-            <wp:extent cx="5612130" cy="3043555"/>
-            <wp:effectExtent l="0" t="0" r="7620" b="4445"/>
-            <wp:docPr id="18" name="Imagen 18"/>
+          <wp:inline distT="0" distB="0" distL="0" distR="0" wp14:anchorId="310E4871" wp14:editId="63E4FBC2">
+            <wp:extent cx="5612130" cy="2976880"/>
+            <wp:effectExtent l="0" t="0" r="7620" b="0"/>
+            <wp:docPr id="2" name="Imagen 2"/>
             <wp:cNvGraphicFramePr>
               <a:graphicFrameLocks xmlns:a="http://schemas.openxmlformats.org/drawingml/2006/main" noChangeAspect="1"/>
             </wp:cNvGraphicFramePr>
@@ -1462,7 +1454,7 @@
                   <pic:spPr>
                     <a:xfrm>
                       <a:off x="0" y="0"/>
-                      <a:ext cx="5612130" cy="3043555"/>
+                      <a:ext cx="5612130" cy="2976880"/>
                     </a:xfrm>
                     <a:prstGeom prst="rect">
                       <a:avLst/>
@@ -1482,1172 +1474,8 @@
           <w:lang w:val="es-VE"/>
         </w:rPr>
       </w:pPr>
-    </w:p>
-    <w:p>
-      <w:pPr>
-        <w:spacing w:after="0"/>
-        <w:rPr>
-          <w:lang w:val="es-VE"/>
-        </w:rPr>
-      </w:pPr>
-      <w:r>
-        <w:rPr>
-          <w:lang w:val="es-VE"/>
-        </w:rPr>
-        <w:t xml:space="preserve">El nuevo test </w:t>
-      </w:r>
-      <w:r>
-        <w:rPr>
-          <w:lang w:val="es-VE"/>
-        </w:rPr>
-        <w:t>llamado “</w:t>
-      </w:r>
-      <w:proofErr w:type="spellStart"/>
-      <w:r>
-        <w:rPr>
-          <w:lang w:val="es-VE"/>
-        </w:rPr>
-        <w:t>login-</w:t>
-      </w:r>
-      <w:proofErr w:type="gramStart"/>
-      <w:r>
-        <w:rPr>
-          <w:lang w:val="es-VE"/>
-        </w:rPr>
-        <w:t>incorrecto.spec</w:t>
-      </w:r>
-      <w:proofErr w:type="gramEnd"/>
-      <w:r>
-        <w:rPr>
-          <w:lang w:val="es-VE"/>
-        </w:rPr>
-        <w:t>.ts</w:t>
-      </w:r>
-      <w:proofErr w:type="spellEnd"/>
-      <w:r>
-        <w:rPr>
-          <w:lang w:val="es-VE"/>
-        </w:rPr>
-        <w:t xml:space="preserve">” </w:t>
-      </w:r>
-      <w:r>
-        <w:rPr>
-          <w:lang w:val="es-VE"/>
-        </w:rPr>
-        <w:t>falla</w:t>
-      </w:r>
-    </w:p>
-    <w:p>
-      <w:pPr>
-        <w:spacing w:after="0"/>
-        <w:rPr>
-          <w:lang w:val="es-VE"/>
-        </w:rPr>
-      </w:pPr>
-    </w:p>
-    <w:p>
-      <w:pPr>
-        <w:spacing w:after="0"/>
-        <w:rPr>
-          <w:lang w:val="es-VE"/>
-        </w:rPr>
-      </w:pPr>
-      <w:r>
-        <w:rPr>
-          <w:noProof/>
-        </w:rPr>
-        <w:drawing>
-          <wp:inline distT="0" distB="0" distL="0" distR="0" wp14:anchorId="556E76E5" wp14:editId="70BA878E">
-            <wp:extent cx="5612130" cy="3086100"/>
-            <wp:effectExtent l="0" t="0" r="7620" b="0"/>
-            <wp:docPr id="19" name="Imagen 19"/>
-            <wp:cNvGraphicFramePr>
-              <a:graphicFrameLocks xmlns:a="http://schemas.openxmlformats.org/drawingml/2006/main" noChangeAspect="1"/>
-            </wp:cNvGraphicFramePr>
-            <a:graphic xmlns:a="http://schemas.openxmlformats.org/drawingml/2006/main">
-              <a:graphicData uri="http://schemas.openxmlformats.org/drawingml/2006/picture">
-                <pic:pic xmlns:pic="http://schemas.openxmlformats.org/drawingml/2006/picture">
-                  <pic:nvPicPr>
-                    <pic:cNvPr id="1" name=""/>
-                    <pic:cNvPicPr/>
-                  </pic:nvPicPr>
-                  <pic:blipFill>
-                    <a:blip r:embed="rId18"/>
-                    <a:stretch>
-                      <a:fillRect/>
-                    </a:stretch>
-                  </pic:blipFill>
-                  <pic:spPr>
-                    <a:xfrm>
-                      <a:off x="0" y="0"/>
-                      <a:ext cx="5612130" cy="3086100"/>
-                    </a:xfrm>
-                    <a:prstGeom prst="rect">
-                      <a:avLst/>
-                    </a:prstGeom>
-                  </pic:spPr>
-                </pic:pic>
-              </a:graphicData>
-            </a:graphic>
-          </wp:inline>
-        </w:drawing>
-      </w:r>
-    </w:p>
-    <w:p>
-      <w:pPr>
-        <w:spacing w:after="0"/>
-        <w:rPr>
-          <w:lang w:val="es-VE"/>
-        </w:rPr>
-      </w:pPr>
-      <w:r>
-        <w:rPr>
-          <w:noProof/>
-        </w:rPr>
-        <w:lastRenderedPageBreak/>
-        <w:drawing>
-          <wp:inline distT="0" distB="0" distL="0" distR="0" wp14:anchorId="08614495" wp14:editId="3196BC10">
-            <wp:extent cx="5612130" cy="1598930"/>
-            <wp:effectExtent l="0" t="0" r="7620" b="1270"/>
-            <wp:docPr id="20" name="Imagen 20"/>
-            <wp:cNvGraphicFramePr>
-              <a:graphicFrameLocks xmlns:a="http://schemas.openxmlformats.org/drawingml/2006/main" noChangeAspect="1"/>
-            </wp:cNvGraphicFramePr>
-            <a:graphic xmlns:a="http://schemas.openxmlformats.org/drawingml/2006/main">
-              <a:graphicData uri="http://schemas.openxmlformats.org/drawingml/2006/picture">
-                <pic:pic xmlns:pic="http://schemas.openxmlformats.org/drawingml/2006/picture">
-                  <pic:nvPicPr>
-                    <pic:cNvPr id="1" name=""/>
-                    <pic:cNvPicPr/>
-                  </pic:nvPicPr>
-                  <pic:blipFill>
-                    <a:blip r:embed="rId19"/>
-                    <a:stretch>
-                      <a:fillRect/>
-                    </a:stretch>
-                  </pic:blipFill>
-                  <pic:spPr>
-                    <a:xfrm>
-                      <a:off x="0" y="0"/>
-                      <a:ext cx="5612130" cy="1598930"/>
-                    </a:xfrm>
-                    <a:prstGeom prst="rect">
-                      <a:avLst/>
-                    </a:prstGeom>
-                  </pic:spPr>
-                </pic:pic>
-              </a:graphicData>
-            </a:graphic>
-          </wp:inline>
-        </w:drawing>
-      </w:r>
-    </w:p>
-    <w:p>
-      <w:pPr>
-        <w:spacing w:after="0"/>
-        <w:rPr>
-          <w:lang w:val="es-VE"/>
-        </w:rPr>
-      </w:pPr>
-    </w:p>
-    <w:p>
-      <w:pPr>
-        <w:spacing w:after="0"/>
-        <w:rPr>
-          <w:lang w:val="es-VE"/>
-        </w:rPr>
-      </w:pPr>
-      <w:r>
-        <w:rPr>
-          <w:noProof/>
-        </w:rPr>
-        <w:drawing>
-          <wp:inline distT="0" distB="0" distL="0" distR="0" wp14:anchorId="2BAF66FE" wp14:editId="030EF379">
-            <wp:extent cx="5612130" cy="2910840"/>
-            <wp:effectExtent l="0" t="0" r="7620" b="3810"/>
-            <wp:docPr id="24" name="Imagen 24"/>
-            <wp:cNvGraphicFramePr>
-              <a:graphicFrameLocks xmlns:a="http://schemas.openxmlformats.org/drawingml/2006/main" noChangeAspect="1"/>
-            </wp:cNvGraphicFramePr>
-            <a:graphic xmlns:a="http://schemas.openxmlformats.org/drawingml/2006/main">
-              <a:graphicData uri="http://schemas.openxmlformats.org/drawingml/2006/picture">
-                <pic:pic xmlns:pic="http://schemas.openxmlformats.org/drawingml/2006/picture">
-                  <pic:nvPicPr>
-                    <pic:cNvPr id="1" name=""/>
-                    <pic:cNvPicPr/>
-                  </pic:nvPicPr>
-                  <pic:blipFill>
-                    <a:blip r:embed="rId20"/>
-                    <a:stretch>
-                      <a:fillRect/>
-                    </a:stretch>
-                  </pic:blipFill>
-                  <pic:spPr>
-                    <a:xfrm>
-                      <a:off x="0" y="0"/>
-                      <a:ext cx="5612130" cy="2910840"/>
-                    </a:xfrm>
-                    <a:prstGeom prst="rect">
-                      <a:avLst/>
-                    </a:prstGeom>
-                  </pic:spPr>
-                </pic:pic>
-              </a:graphicData>
-            </a:graphic>
-          </wp:inline>
-        </w:drawing>
-      </w:r>
-    </w:p>
-    <w:p>
-      <w:pPr>
-        <w:spacing w:after="0"/>
-        <w:rPr>
-          <w:lang w:val="es-VE"/>
-        </w:rPr>
-      </w:pPr>
-    </w:p>
-    <w:p>
-      <w:pPr>
-        <w:spacing w:after="0"/>
-        <w:rPr>
-          <w:lang w:val="es-VE"/>
-        </w:rPr>
-      </w:pPr>
-      <w:r>
-        <w:rPr>
-          <w:lang w:val="es-VE"/>
-        </w:rPr>
-        <w:t>Se le consulta al agente cual es el error y que indique que se debe hacer para corregirlo</w:t>
-      </w:r>
-    </w:p>
-    <w:p>
-      <w:pPr>
-        <w:spacing w:after="0"/>
-        <w:rPr>
-          <w:lang w:val="es-VE"/>
-        </w:rPr>
-      </w:pPr>
-    </w:p>
-    <w:p>
-      <w:pPr>
-        <w:spacing w:after="0"/>
-        <w:rPr>
-          <w:lang w:val="es-VE"/>
-        </w:rPr>
-      </w:pPr>
-      <w:r>
-        <w:rPr>
-          <w:noProof/>
-        </w:rPr>
-        <w:lastRenderedPageBreak/>
-        <w:drawing>
-          <wp:inline distT="0" distB="0" distL="0" distR="0" wp14:anchorId="233CF562" wp14:editId="02F80252">
-            <wp:extent cx="5612130" cy="3085465"/>
-            <wp:effectExtent l="0" t="0" r="7620" b="635"/>
-            <wp:docPr id="21" name="Imagen 21"/>
-            <wp:cNvGraphicFramePr>
-              <a:graphicFrameLocks xmlns:a="http://schemas.openxmlformats.org/drawingml/2006/main" noChangeAspect="1"/>
-            </wp:cNvGraphicFramePr>
-            <a:graphic xmlns:a="http://schemas.openxmlformats.org/drawingml/2006/main">
-              <a:graphicData uri="http://schemas.openxmlformats.org/drawingml/2006/picture">
-                <pic:pic xmlns:pic="http://schemas.openxmlformats.org/drawingml/2006/picture">
-                  <pic:nvPicPr>
-                    <pic:cNvPr id="1" name=""/>
-                    <pic:cNvPicPr/>
-                  </pic:nvPicPr>
-                  <pic:blipFill>
-                    <a:blip r:embed="rId21"/>
-                    <a:stretch>
-                      <a:fillRect/>
-                    </a:stretch>
-                  </pic:blipFill>
-                  <pic:spPr>
-                    <a:xfrm>
-                      <a:off x="0" y="0"/>
-                      <a:ext cx="5612130" cy="3085465"/>
-                    </a:xfrm>
-                    <a:prstGeom prst="rect">
-                      <a:avLst/>
-                    </a:prstGeom>
-                  </pic:spPr>
-                </pic:pic>
-              </a:graphicData>
-            </a:graphic>
-          </wp:inline>
-        </w:drawing>
-      </w:r>
-    </w:p>
-    <w:p>
-      <w:pPr>
-        <w:spacing w:after="0"/>
-        <w:rPr>
-          <w:lang w:val="es-VE"/>
-        </w:rPr>
-      </w:pPr>
-      <w:r>
-        <w:rPr>
-          <w:noProof/>
-        </w:rPr>
-        <w:drawing>
-          <wp:inline distT="0" distB="0" distL="0" distR="0" wp14:anchorId="7A453BA2" wp14:editId="0A1499FF">
-            <wp:extent cx="5612130" cy="3080385"/>
-            <wp:effectExtent l="0" t="0" r="7620" b="5715"/>
-            <wp:docPr id="22" name="Imagen 22"/>
-            <wp:cNvGraphicFramePr>
-              <a:graphicFrameLocks xmlns:a="http://schemas.openxmlformats.org/drawingml/2006/main" noChangeAspect="1"/>
-            </wp:cNvGraphicFramePr>
-            <a:graphic xmlns:a="http://schemas.openxmlformats.org/drawingml/2006/main">
-              <a:graphicData uri="http://schemas.openxmlformats.org/drawingml/2006/picture">
-                <pic:pic xmlns:pic="http://schemas.openxmlformats.org/drawingml/2006/picture">
-                  <pic:nvPicPr>
-                    <pic:cNvPr id="1" name=""/>
-                    <pic:cNvPicPr/>
-                  </pic:nvPicPr>
-                  <pic:blipFill>
-                    <a:blip r:embed="rId22"/>
-                    <a:stretch>
-                      <a:fillRect/>
-                    </a:stretch>
-                  </pic:blipFill>
-                  <pic:spPr>
-                    <a:xfrm>
-                      <a:off x="0" y="0"/>
-                      <a:ext cx="5612130" cy="3080385"/>
-                    </a:xfrm>
-                    <a:prstGeom prst="rect">
-                      <a:avLst/>
-                    </a:prstGeom>
-                  </pic:spPr>
-                </pic:pic>
-              </a:graphicData>
-            </a:graphic>
-          </wp:inline>
-        </w:drawing>
-      </w:r>
-    </w:p>
-    <w:p>
-      <w:pPr>
-        <w:spacing w:after="0"/>
-        <w:rPr>
-          <w:lang w:val="es-VE"/>
-        </w:rPr>
-      </w:pPr>
-    </w:p>
-    <w:p>
-      <w:pPr>
-        <w:spacing w:after="0"/>
-        <w:rPr>
-          <w:lang w:val="es-VE"/>
-        </w:rPr>
-      </w:pPr>
-      <w:r>
-        <w:rPr>
-          <w:lang w:val="es-VE"/>
-        </w:rPr>
-        <w:t>Este es el mensaje que el agente no encuentra:</w:t>
-      </w:r>
-    </w:p>
-    <w:p>
-      <w:pPr>
-        <w:spacing w:after="0"/>
-        <w:rPr>
-          <w:lang w:val="es-VE"/>
-        </w:rPr>
-      </w:pPr>
-    </w:p>
-    <w:p>
-      <w:pPr>
-        <w:spacing w:after="0"/>
-        <w:rPr>
-          <w:lang w:val="es-VE"/>
-        </w:rPr>
-      </w:pPr>
-      <w:r>
-        <w:rPr>
-          <w:noProof/>
-        </w:rPr>
-        <w:lastRenderedPageBreak/>
-        <w:drawing>
-          <wp:inline distT="0" distB="0" distL="0" distR="0" wp14:anchorId="623CB705" wp14:editId="53982E54">
-            <wp:extent cx="5612130" cy="2865755"/>
-            <wp:effectExtent l="0" t="0" r="7620" b="0"/>
-            <wp:docPr id="23" name="Imagen 23"/>
-            <wp:cNvGraphicFramePr>
-              <a:graphicFrameLocks xmlns:a="http://schemas.openxmlformats.org/drawingml/2006/main" noChangeAspect="1"/>
-            </wp:cNvGraphicFramePr>
-            <a:graphic xmlns:a="http://schemas.openxmlformats.org/drawingml/2006/main">
-              <a:graphicData uri="http://schemas.openxmlformats.org/drawingml/2006/picture">
-                <pic:pic xmlns:pic="http://schemas.openxmlformats.org/drawingml/2006/picture">
-                  <pic:nvPicPr>
-                    <pic:cNvPr id="1" name=""/>
-                    <pic:cNvPicPr/>
-                  </pic:nvPicPr>
-                  <pic:blipFill>
-                    <a:blip r:embed="rId23"/>
-                    <a:stretch>
-                      <a:fillRect/>
-                    </a:stretch>
-                  </pic:blipFill>
-                  <pic:spPr>
-                    <a:xfrm>
-                      <a:off x="0" y="0"/>
-                      <a:ext cx="5612130" cy="2865755"/>
-                    </a:xfrm>
-                    <a:prstGeom prst="rect">
-                      <a:avLst/>
-                    </a:prstGeom>
-                  </pic:spPr>
-                </pic:pic>
-              </a:graphicData>
-            </a:graphic>
-          </wp:inline>
-        </w:drawing>
-      </w:r>
-    </w:p>
-    <w:p>
-      <w:pPr>
-        <w:spacing w:after="0"/>
-        <w:rPr>
-          <w:lang w:val="es-VE"/>
-        </w:rPr>
-      </w:pPr>
-    </w:p>
-    <w:p>
-      <w:pPr>
-        <w:spacing w:after="0"/>
-        <w:rPr>
-          <w:lang w:val="es-VE"/>
-        </w:rPr>
-      </w:pPr>
-      <w:r>
-        <w:rPr>
-          <w:lang w:val="es-VE"/>
-        </w:rPr>
-        <w:t xml:space="preserve">Se corrige el mensaje manualmente en el archivo </w:t>
-      </w:r>
-      <w:proofErr w:type="spellStart"/>
-      <w:r>
-        <w:rPr>
-          <w:lang w:val="es-VE"/>
-        </w:rPr>
-        <w:t>login-</w:t>
-      </w:r>
-      <w:proofErr w:type="gramStart"/>
-      <w:r>
-        <w:rPr>
-          <w:lang w:val="es-VE"/>
-        </w:rPr>
-        <w:t>incorrecto.spec</w:t>
-      </w:r>
-      <w:proofErr w:type="gramEnd"/>
-      <w:r>
-        <w:rPr>
-          <w:lang w:val="es-VE"/>
-        </w:rPr>
-        <w:t>.ts</w:t>
-      </w:r>
-      <w:proofErr w:type="spellEnd"/>
-    </w:p>
-    <w:p>
-      <w:pPr>
-        <w:spacing w:after="0"/>
-        <w:rPr>
-          <w:lang w:val="es-VE"/>
-        </w:rPr>
-      </w:pPr>
-    </w:p>
-    <w:p>
-      <w:pPr>
-        <w:spacing w:after="0"/>
-        <w:rPr>
-          <w:lang w:val="es-VE"/>
-        </w:rPr>
-      </w:pPr>
-      <w:r>
-        <w:rPr>
-          <w:noProof/>
-        </w:rPr>
-        <w:drawing>
-          <wp:inline distT="0" distB="0" distL="0" distR="0" wp14:anchorId="57FED8CB" wp14:editId="2D04DB7A">
-            <wp:extent cx="5612130" cy="3082925"/>
-            <wp:effectExtent l="0" t="0" r="7620" b="3175"/>
-            <wp:docPr id="25" name="Imagen 25"/>
-            <wp:cNvGraphicFramePr>
-              <a:graphicFrameLocks xmlns:a="http://schemas.openxmlformats.org/drawingml/2006/main" noChangeAspect="1"/>
-            </wp:cNvGraphicFramePr>
-            <a:graphic xmlns:a="http://schemas.openxmlformats.org/drawingml/2006/main">
-              <a:graphicData uri="http://schemas.openxmlformats.org/drawingml/2006/picture">
-                <pic:pic xmlns:pic="http://schemas.openxmlformats.org/drawingml/2006/picture">
-                  <pic:nvPicPr>
-                    <pic:cNvPr id="1" name=""/>
-                    <pic:cNvPicPr/>
-                  </pic:nvPicPr>
-                  <pic:blipFill>
-                    <a:blip r:embed="rId24"/>
-                    <a:stretch>
-                      <a:fillRect/>
-                    </a:stretch>
-                  </pic:blipFill>
-                  <pic:spPr>
-                    <a:xfrm>
-                      <a:off x="0" y="0"/>
-                      <a:ext cx="5612130" cy="3082925"/>
-                    </a:xfrm>
-                    <a:prstGeom prst="rect">
-                      <a:avLst/>
-                    </a:prstGeom>
-                  </pic:spPr>
-                </pic:pic>
-              </a:graphicData>
-            </a:graphic>
-          </wp:inline>
-        </w:drawing>
-      </w:r>
-    </w:p>
-    <w:p>
-      <w:pPr>
-        <w:spacing w:after="0"/>
-        <w:rPr>
-          <w:lang w:val="es-VE"/>
-        </w:rPr>
-      </w:pPr>
-    </w:p>
-    <w:p>
-      <w:pPr>
-        <w:spacing w:after="0"/>
-        <w:rPr>
-          <w:lang w:val="es-VE"/>
-        </w:rPr>
-      </w:pPr>
-      <w:r>
-        <w:rPr>
-          <w:lang w:val="es-VE"/>
-        </w:rPr>
-        <w:t>Se ejecuta el test y se vuelve a presentar un error, pero esta vez con el “</w:t>
-      </w:r>
-      <w:proofErr w:type="spellStart"/>
-      <w:r>
-        <w:rPr>
-          <w:lang w:val="es-VE"/>
-        </w:rPr>
-        <w:t>Locator</w:t>
-      </w:r>
-      <w:proofErr w:type="spellEnd"/>
-      <w:r>
-        <w:rPr>
-          <w:lang w:val="es-VE"/>
-        </w:rPr>
-        <w:t>”</w:t>
-      </w:r>
-    </w:p>
-    <w:p>
-      <w:pPr>
-        <w:spacing w:after="0"/>
-        <w:rPr>
-          <w:lang w:val="es-VE"/>
-        </w:rPr>
-      </w:pPr>
-    </w:p>
-    <w:p>
-      <w:pPr>
-        <w:spacing w:after="0"/>
-        <w:rPr>
-          <w:lang w:val="es-VE"/>
-        </w:rPr>
-      </w:pPr>
-      <w:r>
-        <w:rPr>
-          <w:noProof/>
-        </w:rPr>
-        <w:lastRenderedPageBreak/>
-        <w:drawing>
-          <wp:inline distT="0" distB="0" distL="0" distR="0" wp14:anchorId="28E4FD69" wp14:editId="2172EC63">
-            <wp:extent cx="5612130" cy="3044825"/>
-            <wp:effectExtent l="0" t="0" r="7620" b="3175"/>
-            <wp:docPr id="26" name="Imagen 26"/>
-            <wp:cNvGraphicFramePr>
-              <a:graphicFrameLocks xmlns:a="http://schemas.openxmlformats.org/drawingml/2006/main" noChangeAspect="1"/>
-            </wp:cNvGraphicFramePr>
-            <a:graphic xmlns:a="http://schemas.openxmlformats.org/drawingml/2006/main">
-              <a:graphicData uri="http://schemas.openxmlformats.org/drawingml/2006/picture">
-                <pic:pic xmlns:pic="http://schemas.openxmlformats.org/drawingml/2006/picture">
-                  <pic:nvPicPr>
-                    <pic:cNvPr id="1" name=""/>
-                    <pic:cNvPicPr/>
-                  </pic:nvPicPr>
-                  <pic:blipFill>
-                    <a:blip r:embed="rId25"/>
-                    <a:stretch>
-                      <a:fillRect/>
-                    </a:stretch>
-                  </pic:blipFill>
-                  <pic:spPr>
-                    <a:xfrm>
-                      <a:off x="0" y="0"/>
-                      <a:ext cx="5612130" cy="3044825"/>
-                    </a:xfrm>
-                    <a:prstGeom prst="rect">
-                      <a:avLst/>
-                    </a:prstGeom>
-                  </pic:spPr>
-                </pic:pic>
-              </a:graphicData>
-            </a:graphic>
-          </wp:inline>
-        </w:drawing>
-      </w:r>
-    </w:p>
-    <w:p>
-      <w:pPr>
-        <w:spacing w:after="0"/>
-        <w:rPr>
-          <w:lang w:val="es-VE"/>
-        </w:rPr>
-      </w:pPr>
-      <w:r>
-        <w:rPr>
-          <w:noProof/>
-        </w:rPr>
-        <w:drawing>
-          <wp:inline distT="0" distB="0" distL="0" distR="0" wp14:anchorId="78FC95EB" wp14:editId="4BC429CD">
-            <wp:extent cx="5612130" cy="3044825"/>
-            <wp:effectExtent l="0" t="0" r="7620" b="3175"/>
-            <wp:docPr id="27" name="Imagen 27"/>
-            <wp:cNvGraphicFramePr>
-              <a:graphicFrameLocks xmlns:a="http://schemas.openxmlformats.org/drawingml/2006/main" noChangeAspect="1"/>
-            </wp:cNvGraphicFramePr>
-            <a:graphic xmlns:a="http://schemas.openxmlformats.org/drawingml/2006/main">
-              <a:graphicData uri="http://schemas.openxmlformats.org/drawingml/2006/picture">
-                <pic:pic xmlns:pic="http://schemas.openxmlformats.org/drawingml/2006/picture">
-                  <pic:nvPicPr>
-                    <pic:cNvPr id="1" name=""/>
-                    <pic:cNvPicPr/>
-                  </pic:nvPicPr>
-                  <pic:blipFill>
-                    <a:blip r:embed="rId26"/>
-                    <a:stretch>
-                      <a:fillRect/>
-                    </a:stretch>
-                  </pic:blipFill>
-                  <pic:spPr>
-                    <a:xfrm>
-                      <a:off x="0" y="0"/>
-                      <a:ext cx="5612130" cy="3044825"/>
-                    </a:xfrm>
-                    <a:prstGeom prst="rect">
-                      <a:avLst/>
-                    </a:prstGeom>
-                  </pic:spPr>
-                </pic:pic>
-              </a:graphicData>
-            </a:graphic>
-          </wp:inline>
-        </w:drawing>
-      </w:r>
-    </w:p>
-    <w:p>
-      <w:pPr>
-        <w:spacing w:after="0"/>
-        <w:rPr>
-          <w:lang w:val="es-VE"/>
-        </w:rPr>
-      </w:pPr>
-    </w:p>
-    <w:p>
-      <w:pPr>
-        <w:spacing w:after="0"/>
-        <w:rPr>
-          <w:lang w:val="es-VE"/>
-        </w:rPr>
-      </w:pPr>
-      <w:r>
-        <w:rPr>
-          <w:noProof/>
-        </w:rPr>
-        <w:lastRenderedPageBreak/>
-        <w:drawing>
-          <wp:inline distT="0" distB="0" distL="0" distR="0" wp14:anchorId="1C51F89F" wp14:editId="7440B200">
-            <wp:extent cx="5612130" cy="2871470"/>
-            <wp:effectExtent l="0" t="0" r="7620" b="5080"/>
-            <wp:docPr id="29" name="Imagen 29"/>
-            <wp:cNvGraphicFramePr>
-              <a:graphicFrameLocks xmlns:a="http://schemas.openxmlformats.org/drawingml/2006/main" noChangeAspect="1"/>
-            </wp:cNvGraphicFramePr>
-            <a:graphic xmlns:a="http://schemas.openxmlformats.org/drawingml/2006/main">
-              <a:graphicData uri="http://schemas.openxmlformats.org/drawingml/2006/picture">
-                <pic:pic xmlns:pic="http://schemas.openxmlformats.org/drawingml/2006/picture">
-                  <pic:nvPicPr>
-                    <pic:cNvPr id="1" name=""/>
-                    <pic:cNvPicPr/>
-                  </pic:nvPicPr>
-                  <pic:blipFill>
-                    <a:blip r:embed="rId27"/>
-                    <a:stretch>
-                      <a:fillRect/>
-                    </a:stretch>
-                  </pic:blipFill>
-                  <pic:spPr>
-                    <a:xfrm>
-                      <a:off x="0" y="0"/>
-                      <a:ext cx="5612130" cy="2871470"/>
-                    </a:xfrm>
-                    <a:prstGeom prst="rect">
-                      <a:avLst/>
-                    </a:prstGeom>
-                  </pic:spPr>
-                </pic:pic>
-              </a:graphicData>
-            </a:graphic>
-          </wp:inline>
-        </w:drawing>
-      </w:r>
-    </w:p>
-    <w:p>
-      <w:pPr>
-        <w:spacing w:after="0"/>
-        <w:rPr>
-          <w:lang w:val="es-VE"/>
-        </w:rPr>
-      </w:pPr>
-    </w:p>
-    <w:p>
-      <w:pPr>
-        <w:spacing w:after="0"/>
-        <w:rPr>
-          <w:lang w:val="es-VE"/>
-        </w:rPr>
-      </w:pPr>
-      <w:r>
-        <w:rPr>
-          <w:lang w:val="es-VE"/>
-        </w:rPr>
-        <w:t xml:space="preserve">Se hizo la consulta sobre el mensaje de error al Agente y se le pregunto </w:t>
-      </w:r>
-      <w:proofErr w:type="spellStart"/>
-      <w:r>
-        <w:rPr>
-          <w:lang w:val="es-VE"/>
-        </w:rPr>
-        <w:t>que</w:t>
-      </w:r>
-      <w:proofErr w:type="spellEnd"/>
-      <w:r>
-        <w:rPr>
-          <w:lang w:val="es-VE"/>
-        </w:rPr>
-        <w:t xml:space="preserve"> se debe hacer para corregir el error</w:t>
-      </w:r>
-    </w:p>
-    <w:p>
-      <w:pPr>
-        <w:spacing w:after="0"/>
-        <w:rPr>
-          <w:lang w:val="es-VE"/>
-        </w:rPr>
-      </w:pPr>
-    </w:p>
-    <w:p>
-      <w:pPr>
-        <w:spacing w:after="0"/>
-        <w:rPr>
-          <w:lang w:val="es-VE"/>
-        </w:rPr>
-      </w:pPr>
-      <w:r>
-        <w:rPr>
-          <w:noProof/>
-        </w:rPr>
-        <w:drawing>
-          <wp:inline distT="0" distB="0" distL="0" distR="0" wp14:anchorId="7E75A601" wp14:editId="72466EAB">
-            <wp:extent cx="5612130" cy="3090545"/>
-            <wp:effectExtent l="0" t="0" r="7620" b="0"/>
-            <wp:docPr id="28" name="Imagen 28"/>
-            <wp:cNvGraphicFramePr>
-              <a:graphicFrameLocks xmlns:a="http://schemas.openxmlformats.org/drawingml/2006/main" noChangeAspect="1"/>
-            </wp:cNvGraphicFramePr>
-            <a:graphic xmlns:a="http://schemas.openxmlformats.org/drawingml/2006/main">
-              <a:graphicData uri="http://schemas.openxmlformats.org/drawingml/2006/picture">
-                <pic:pic xmlns:pic="http://schemas.openxmlformats.org/drawingml/2006/picture">
-                  <pic:nvPicPr>
-                    <pic:cNvPr id="1" name=""/>
-                    <pic:cNvPicPr/>
-                  </pic:nvPicPr>
-                  <pic:blipFill>
-                    <a:blip r:embed="rId28"/>
-                    <a:stretch>
-                      <a:fillRect/>
-                    </a:stretch>
-                  </pic:blipFill>
-                  <pic:spPr>
-                    <a:xfrm>
-                      <a:off x="0" y="0"/>
-                      <a:ext cx="5612130" cy="3090545"/>
-                    </a:xfrm>
-                    <a:prstGeom prst="rect">
-                      <a:avLst/>
-                    </a:prstGeom>
-                  </pic:spPr>
-                </pic:pic>
-              </a:graphicData>
-            </a:graphic>
-          </wp:inline>
-        </w:drawing>
-      </w:r>
-    </w:p>
-    <w:p>
-      <w:pPr>
-        <w:spacing w:after="0"/>
-        <w:rPr>
-          <w:lang w:val="es-VE"/>
-        </w:rPr>
-      </w:pPr>
-      <w:r>
-        <w:rPr>
-          <w:noProof/>
-        </w:rPr>
-        <w:lastRenderedPageBreak/>
-        <w:drawing>
-          <wp:inline distT="0" distB="0" distL="0" distR="0" wp14:anchorId="213124C8" wp14:editId="136E7B9B">
-            <wp:extent cx="5612130" cy="3071495"/>
-            <wp:effectExtent l="0" t="0" r="7620" b="0"/>
-            <wp:docPr id="30" name="Imagen 30"/>
-            <wp:cNvGraphicFramePr>
-              <a:graphicFrameLocks xmlns:a="http://schemas.openxmlformats.org/drawingml/2006/main" noChangeAspect="1"/>
-            </wp:cNvGraphicFramePr>
-            <a:graphic xmlns:a="http://schemas.openxmlformats.org/drawingml/2006/main">
-              <a:graphicData uri="http://schemas.openxmlformats.org/drawingml/2006/picture">
-                <pic:pic xmlns:pic="http://schemas.openxmlformats.org/drawingml/2006/picture">
-                  <pic:nvPicPr>
-                    <pic:cNvPr id="1" name=""/>
-                    <pic:cNvPicPr/>
-                  </pic:nvPicPr>
-                  <pic:blipFill>
-                    <a:blip r:embed="rId29"/>
-                    <a:stretch>
-                      <a:fillRect/>
-                    </a:stretch>
-                  </pic:blipFill>
-                  <pic:spPr>
-                    <a:xfrm>
-                      <a:off x="0" y="0"/>
-                      <a:ext cx="5612130" cy="3071495"/>
-                    </a:xfrm>
-                    <a:prstGeom prst="rect">
-                      <a:avLst/>
-                    </a:prstGeom>
-                  </pic:spPr>
-                </pic:pic>
-              </a:graphicData>
-            </a:graphic>
-          </wp:inline>
-        </w:drawing>
-      </w:r>
-    </w:p>
-    <w:p>
-      <w:pPr>
-        <w:spacing w:after="0"/>
-        <w:rPr>
-          <w:lang w:val="es-VE"/>
-        </w:rPr>
-      </w:pPr>
-    </w:p>
-    <w:p>
-      <w:pPr>
-        <w:spacing w:after="0"/>
-        <w:rPr>
-          <w:lang w:val="es-VE"/>
-        </w:rPr>
-      </w:pPr>
-      <w:r>
-        <w:rPr>
-          <w:lang w:val="es-VE"/>
-        </w:rPr>
-        <w:t xml:space="preserve">En la parte de verificación del test se </w:t>
-      </w:r>
-      <w:proofErr w:type="spellStart"/>
-      <w:r>
-        <w:rPr>
-          <w:lang w:val="es-VE"/>
-        </w:rPr>
-        <w:t>corrigio</w:t>
-      </w:r>
-      <w:proofErr w:type="spellEnd"/>
-      <w:r>
-        <w:rPr>
-          <w:lang w:val="es-VE"/>
-        </w:rPr>
-        <w:t xml:space="preserve"> manualmente </w:t>
-      </w:r>
-      <w:r>
-        <w:rPr>
-          <w:lang w:val="es-VE"/>
-        </w:rPr>
-        <w:t>el error agregando “</w:t>
-      </w:r>
-      <w:r>
-        <w:rPr>
-          <w:lang w:val="es-VE"/>
-        </w:rPr>
-        <w:t>{</w:t>
-      </w:r>
-      <w:proofErr w:type="spellStart"/>
-      <w:r>
-        <w:rPr>
-          <w:lang w:val="es-VE"/>
-        </w:rPr>
-        <w:t>exact</w:t>
-      </w:r>
-      <w:proofErr w:type="spellEnd"/>
-      <w:r>
-        <w:rPr>
-          <w:lang w:val="es-VE"/>
-        </w:rPr>
-        <w:t>: false}</w:t>
-      </w:r>
-      <w:r>
-        <w:rPr>
-          <w:lang w:val="es-VE"/>
-        </w:rPr>
-        <w:t xml:space="preserve">” que </w:t>
-      </w:r>
-      <w:r>
-        <w:rPr>
-          <w:lang w:val="es-VE"/>
-        </w:rPr>
-        <w:t>es una propiedad booleana que controla si la búsqueda de texto debe coincidir exactamente o de forma parcial.</w:t>
-      </w:r>
       <w:bookmarkStart w:id="0" w:name="_GoBack"/>
       <w:bookmarkEnd w:id="0"/>
-    </w:p>
-    <w:p>
-      <w:pPr>
-        <w:spacing w:after="0"/>
-        <w:rPr>
-          <w:lang w:val="es-VE"/>
-        </w:rPr>
-      </w:pPr>
-    </w:p>
-    <w:p>
-      <w:pPr>
-        <w:spacing w:after="0"/>
-        <w:rPr>
-          <w:lang w:val="es-VE"/>
-        </w:rPr>
-      </w:pPr>
-      <w:r>
-        <w:rPr>
-          <w:noProof/>
-        </w:rPr>
-        <w:drawing>
-          <wp:inline distT="0" distB="0" distL="0" distR="0" wp14:anchorId="40BEA906" wp14:editId="798A77AE">
-            <wp:extent cx="5612130" cy="3094990"/>
-            <wp:effectExtent l="0" t="0" r="7620" b="0"/>
-            <wp:docPr id="33" name="Imagen 33"/>
-            <wp:cNvGraphicFramePr>
-              <a:graphicFrameLocks xmlns:a="http://schemas.openxmlformats.org/drawingml/2006/main" noChangeAspect="1"/>
-            </wp:cNvGraphicFramePr>
-            <a:graphic xmlns:a="http://schemas.openxmlformats.org/drawingml/2006/main">
-              <a:graphicData uri="http://schemas.openxmlformats.org/drawingml/2006/picture">
-                <pic:pic xmlns:pic="http://schemas.openxmlformats.org/drawingml/2006/picture">
-                  <pic:nvPicPr>
-                    <pic:cNvPr id="1" name=""/>
-                    <pic:cNvPicPr/>
-                  </pic:nvPicPr>
-                  <pic:blipFill>
-                    <a:blip r:embed="rId30"/>
-                    <a:stretch>
-                      <a:fillRect/>
-                    </a:stretch>
-                  </pic:blipFill>
-                  <pic:spPr>
-                    <a:xfrm>
-                      <a:off x="0" y="0"/>
-                      <a:ext cx="5612130" cy="3094990"/>
-                    </a:xfrm>
-                    <a:prstGeom prst="rect">
-                      <a:avLst/>
-                    </a:prstGeom>
-                  </pic:spPr>
-                </pic:pic>
-              </a:graphicData>
-            </a:graphic>
-          </wp:inline>
-        </w:drawing>
-      </w:r>
-    </w:p>
-    <w:p>
-      <w:pPr>
-        <w:spacing w:after="0"/>
-        <w:rPr>
-          <w:lang w:val="es-VE"/>
-        </w:rPr>
-      </w:pPr>
-    </w:p>
-    <w:p>
-      <w:pPr>
-        <w:spacing w:after="0"/>
-        <w:rPr>
-          <w:lang w:val="es-VE"/>
-        </w:rPr>
-      </w:pPr>
-    </w:p>
-    <w:p>
-      <w:pPr>
-        <w:spacing w:after="0"/>
-        <w:rPr>
-          <w:lang w:val="es-VE"/>
-        </w:rPr>
-      </w:pPr>
-    </w:p>
-    <w:p>
-      <w:pPr>
-        <w:spacing w:after="0"/>
-        <w:rPr>
-          <w:lang w:val="es-VE"/>
-        </w:rPr>
-      </w:pPr>
-    </w:p>
-    <w:p>
-      <w:pPr>
-        <w:spacing w:after="0"/>
-        <w:rPr>
-          <w:lang w:val="es-VE"/>
-        </w:rPr>
-      </w:pPr>
-      <w:r>
-        <w:rPr>
-          <w:lang w:val="es-VE"/>
-        </w:rPr>
-        <w:t xml:space="preserve"> </w:t>
-      </w:r>
-    </w:p>
-    <w:p>
-      <w:pPr>
-        <w:spacing w:after="0"/>
-        <w:rPr>
-          <w:lang w:val="es-VE"/>
-        </w:rPr>
-      </w:pPr>
-    </w:p>
-    <w:p>
-      <w:pPr>
-        <w:spacing w:after="0"/>
-        <w:rPr>
-          <w:lang w:val="es-VE"/>
-        </w:rPr>
-      </w:pPr>
-    </w:p>
-    <w:p>
-      <w:pPr>
-        <w:spacing w:after="0"/>
-        <w:rPr>
-          <w:lang w:val="es-VE"/>
-        </w:rPr>
-      </w:pPr>
-    </w:p>
-    <w:p>
-      <w:pPr>
-        <w:spacing w:after="0"/>
-        <w:rPr>
-          <w:lang w:val="es-VE"/>
-        </w:rPr>
-      </w:pPr>
-    </w:p>
-    <w:p>
-      <w:pPr>
-        <w:spacing w:after="0"/>
-        <w:rPr>
-          <w:lang w:val="es-VE"/>
-        </w:rPr>
-      </w:pPr>
-    </w:p>
-    <w:p>
-      <w:pPr>
-        <w:spacing w:after="0"/>
-        <w:rPr>
-          <w:lang w:val="es-VE"/>
-        </w:rPr>
-      </w:pPr>
-    </w:p>
-    <w:p>
-      <w:pPr>
-        <w:spacing w:after="0"/>
-        <w:rPr>
-          <w:b/>
-          <w:lang w:val="es-VE"/>
-        </w:rPr>
-      </w:pPr>
-    </w:p>
-    <w:p>
-      <w:pPr>
-        <w:spacing w:after="0"/>
-        <w:rPr>
-          <w:b/>
-          <w:lang w:val="es-VE"/>
-        </w:rPr>
-      </w:pPr>
-    </w:p>
-    <w:p>
-      <w:pPr>
-        <w:spacing w:after="0"/>
-        <w:rPr>
-          <w:b/>
-          <w:lang w:val="es-VE"/>
-        </w:rPr>
-      </w:pPr>
-    </w:p>
-    <w:p>
-      <w:pPr>
-        <w:spacing w:after="0"/>
-        <w:rPr>
-          <w:b/>
-          <w:lang w:val="es-VE"/>
-        </w:rPr>
-      </w:pPr>
-    </w:p>
-    <w:p>
-      <w:pPr>
-        <w:spacing w:after="0"/>
-        <w:rPr>
-          <w:b/>
-          <w:lang w:val="es-VE"/>
-        </w:rPr>
-      </w:pPr>
-    </w:p>
-    <w:p>
-      <w:pPr>
-        <w:spacing w:after="0"/>
-        <w:rPr>
-          <w:b/>
-          <w:lang w:val="es-VE"/>
-        </w:rPr>
-      </w:pPr>
-    </w:p>
-    <w:p>
-      <w:pPr>
-        <w:spacing w:after="0"/>
-        <w:rPr>
-          <w:b/>
-          <w:lang w:val="es-VE"/>
-        </w:rPr>
-      </w:pPr>
-    </w:p>
-    <w:p>
-      <w:pPr>
-        <w:spacing w:after="0"/>
-        <w:rPr>
-          <w:b/>
-          <w:color w:val="000099"/>
-          <w:lang w:val="es-VE"/>
-        </w:rPr>
-      </w:pPr>
-    </w:p>
-    <w:p>
-      <w:pPr>
-        <w:rPr>
-          <w:lang w:val="es-VE"/>
-        </w:rPr>
-      </w:pPr>
     </w:p>
     <w:sectPr>
       <w:pgSz w:w="12240" w:h="15840"/>

</xml_diff>